<commit_message>
fix : Text input fields adjusted to content restrictions
</commit_message>
<xml_diff>
--- a/src/GUI/Utils/basedocuments/autoevaluacion.docx
+++ b/src/GUI/Utils/basedocuments/autoevaluacion.docx
@@ -464,9 +464,8 @@
         </w:trPr>
         <w:tc>
           <w:tcPr>
-            <w:tcW w:w="4770" w:type="dxa"/>
-            <w:gridSpan w:val="2"/>
-            <w:shd w:val="clear" w:color="auto" w:fill="BFBFBF" w:themeFill="background1" w:themeFillShade="BF"/>
+            <w:tcW w:w="4056" w:type="dxa"/>
+            <w:shd w:val="clear" w:color="auto" w:fill="BFBFBF"/>
             <w:vAlign w:val="center"/>
           </w:tcPr>
           <w:p>
@@ -484,6 +483,18 @@
               </w:rPr>
               <w:t>CRITERIOS</w:t>
             </w:r>
+          </w:p>
+        </w:tc>
+        <w:tc>
+          <w:tcPr>
+            <w:tcW w:w="713" w:type="dxa"/>
+            <w:shd w:val="clear" w:color="auto" w:fill="BFBFBF"/>
+            <w:vAlign w:val="center"/>
+          </w:tcPr>
+          <w:p>
+            <w:pPr>
+              <w:jc w:val="center"/>
+            </w:pPr>
           </w:p>
         </w:tc>
       </w:tr>
@@ -818,6 +829,32 @@
         <w:gridCol w:w="995"/>
         <w:gridCol w:w="995"/>
       </w:tblGrid>
+      <w:tblPr>
+        <w:tblW w:w="8838" w:type="dxa"/>
+        <w:jc w:val="center"/>
+        <w:tblBorders>
+          <w:top w:val="single" w:sz="4" w:space="0" w:color="auto"/>
+          <w:left w:val="single" w:sz="4" w:space="0" w:color="auto"/>
+          <w:bottom w:val="single" w:sz="4" w:space="0" w:color="auto"/>
+          <w:right w:val="single" w:sz="4" w:space="0" w:color="auto"/>
+          <w:insideH w:val="single" w:sz="4" w:space="0" w:color="auto"/>
+          <w:insideV w:val="single" w:sz="4" w:space="0" w:color="auto"/>
+        </w:tblBorders>
+        <w:tblCellMar>
+          <w:left w:w="70" w:type="dxa"/>
+          <w:right w:w="70" w:type="dxa"/>
+        </w:tblCellMar>
+        <w:tblLook w:val="04A0" w:firstRow="1" w:lastRow="0" w:firstColumn="1" w:lastColumn="0" w:noHBand="0" w:noVBand="1"/>
+      </w:tblPr>
+      <w:tblGrid>
+        <w:gridCol w:w="407"/>
+        <w:gridCol w:w="3456"/>
+        <w:gridCol w:w="995"/>
+        <w:gridCol w:w="995"/>
+        <w:gridCol w:w="995"/>
+        <w:gridCol w:w="995"/>
+        <w:gridCol w:w="995"/>
+      </w:tblGrid>
       <w:tr>
         <w:trPr>
           <w:trHeight w:val="342"/>
@@ -826,7 +863,6 @@
         <w:tc>
           <w:tcPr>
             <w:tcW w:w="407" w:type="dxa"/>
-            <w:noWrap/>
             <w:shd w:val="clear" w:color="auto" w:fill="BFBFBF" w:themeFill="background1" w:themeFillShade="BF"/>
             <w:vAlign w:val="center"/>
           </w:tcPr>
@@ -863,7 +899,6 @@
         <w:tc>
           <w:tcPr>
             <w:tcW w:w="995" w:type="dxa"/>
-            <w:noWrap/>
             <w:shd w:val="clear" w:color="auto" w:fill="BFBFBF" w:themeFill="background1" w:themeFillShade="BF"/>
             <w:vAlign w:val="center"/>
           </w:tcPr>
@@ -887,7 +922,6 @@
         <w:tc>
           <w:tcPr>
             <w:tcW w:w="995" w:type="dxa"/>
-            <w:noWrap/>
             <w:shd w:val="clear" w:color="auto" w:fill="BFBFBF" w:themeFill="background1" w:themeFillShade="BF"/>
             <w:vAlign w:val="center"/>
           </w:tcPr>
@@ -911,7 +945,6 @@
         <w:tc>
           <w:tcPr>
             <w:tcW w:w="995" w:type="dxa"/>
-            <w:noWrap/>
             <w:shd w:val="clear" w:color="auto" w:fill="BFBFBF" w:themeFill="background1" w:themeFillShade="BF"/>
             <w:vAlign w:val="center"/>
           </w:tcPr>
@@ -935,7 +968,6 @@
         <w:tc>
           <w:tcPr>
             <w:tcW w:w="995" w:type="dxa"/>
-            <w:noWrap/>
             <w:shd w:val="clear" w:color="auto" w:fill="BFBFBF" w:themeFill="background1" w:themeFillShade="BF"/>
             <w:vAlign w:val="center"/>
           </w:tcPr>
@@ -959,7 +991,6 @@
         <w:tc>
           <w:tcPr>
             <w:tcW w:w="995" w:type="dxa"/>
-            <w:noWrap/>
             <w:shd w:val="clear" w:color="auto" w:fill="BFBFBF" w:themeFill="background1" w:themeFillShade="BF"/>
             <w:vAlign w:val="center"/>
           </w:tcPr>
@@ -1064,7 +1095,6 @@
         <w:tc>
           <w:tcPr>
             <w:tcW w:w="995" w:type="dxa"/>
-            <w:noWrap/>
             <w:vAlign w:val="center"/>
           </w:tcPr>
           <w:p>
@@ -1091,7 +1121,6 @@
         <w:tc>
           <w:tcPr>
             <w:tcW w:w="995" w:type="dxa"/>
-            <w:noWrap/>
             <w:vAlign w:val="center"/>
           </w:tcPr>
           <w:p>
@@ -1118,7 +1147,6 @@
         <w:tc>
           <w:tcPr>
             <w:tcW w:w="995" w:type="dxa"/>
-            <w:noWrap/>
             <w:vAlign w:val="center"/>
           </w:tcPr>
           <w:p>
@@ -1145,7 +1173,6 @@
         <w:tc>
           <w:tcPr>
             <w:tcW w:w="995" w:type="dxa"/>
-            <w:noWrap/>
             <w:vAlign w:val="center"/>
           </w:tcPr>
           <w:p>
@@ -1172,7 +1199,6 @@
         <w:tc>
           <w:tcPr>
             <w:tcW w:w="995" w:type="dxa"/>
-            <w:noWrap/>
             <w:vAlign w:val="center"/>
           </w:tcPr>
           <w:p>
@@ -1280,7 +1306,6 @@
         <w:tc>
           <w:tcPr>
             <w:tcW w:w="995" w:type="dxa"/>
-            <w:noWrap/>
             <w:vAlign w:val="center"/>
           </w:tcPr>
           <w:p>
@@ -1307,7 +1332,6 @@
         <w:tc>
           <w:tcPr>
             <w:tcW w:w="995" w:type="dxa"/>
-            <w:noWrap/>
             <w:vAlign w:val="center"/>
           </w:tcPr>
           <w:p>
@@ -1334,7 +1358,6 @@
         <w:tc>
           <w:tcPr>
             <w:tcW w:w="995" w:type="dxa"/>
-            <w:noWrap/>
             <w:vAlign w:val="center"/>
           </w:tcPr>
           <w:p>
@@ -1361,7 +1384,6 @@
         <w:tc>
           <w:tcPr>
             <w:tcW w:w="995" w:type="dxa"/>
-            <w:noWrap/>
             <w:vAlign w:val="center"/>
           </w:tcPr>
           <w:p>
@@ -1388,7 +1410,6 @@
         <w:tc>
           <w:tcPr>
             <w:tcW w:w="995" w:type="dxa"/>
-            <w:noWrap/>
             <w:vAlign w:val="center"/>
           </w:tcPr>
           <w:p>
@@ -1478,7 +1499,6 @@
         <w:tc>
           <w:tcPr>
             <w:tcW w:w="995" w:type="dxa"/>
-            <w:noWrap/>
             <w:vAlign w:val="center"/>
           </w:tcPr>
           <w:p>
@@ -1505,7 +1525,6 @@
         <w:tc>
           <w:tcPr>
             <w:tcW w:w="995" w:type="dxa"/>
-            <w:noWrap/>
             <w:vAlign w:val="center"/>
           </w:tcPr>
           <w:p>
@@ -1532,7 +1551,6 @@
         <w:tc>
           <w:tcPr>
             <w:tcW w:w="995" w:type="dxa"/>
-            <w:noWrap/>
             <w:vAlign w:val="center"/>
           </w:tcPr>
           <w:p>
@@ -1559,7 +1577,6 @@
         <w:tc>
           <w:tcPr>
             <w:tcW w:w="995" w:type="dxa"/>
-            <w:noWrap/>
             <w:vAlign w:val="center"/>
           </w:tcPr>
           <w:p>
@@ -1586,7 +1603,6 @@
         <w:tc>
           <w:tcPr>
             <w:tcW w:w="995" w:type="dxa"/>
-            <w:noWrap/>
             <w:vAlign w:val="center"/>
           </w:tcPr>
           <w:p>
@@ -1675,7 +1691,6 @@
         <w:tc>
           <w:tcPr>
             <w:tcW w:w="995" w:type="dxa"/>
-            <w:noWrap/>
             <w:vAlign w:val="center"/>
           </w:tcPr>
           <w:p>
@@ -1702,7 +1717,6 @@
         <w:tc>
           <w:tcPr>
             <w:tcW w:w="995" w:type="dxa"/>
-            <w:noWrap/>
             <w:vAlign w:val="center"/>
           </w:tcPr>
           <w:p>
@@ -1729,7 +1743,6 @@
         <w:tc>
           <w:tcPr>
             <w:tcW w:w="995" w:type="dxa"/>
-            <w:noWrap/>
             <w:vAlign w:val="center"/>
           </w:tcPr>
           <w:p>
@@ -1756,7 +1769,6 @@
         <w:tc>
           <w:tcPr>
             <w:tcW w:w="995" w:type="dxa"/>
-            <w:noWrap/>
             <w:vAlign w:val="center"/>
           </w:tcPr>
           <w:p>
@@ -1783,7 +1795,6 @@
         <w:tc>
           <w:tcPr>
             <w:tcW w:w="995" w:type="dxa"/>
-            <w:noWrap/>
             <w:vAlign w:val="center"/>
           </w:tcPr>
           <w:p>
@@ -1917,7 +1928,6 @@
         <w:tc>
           <w:tcPr>
             <w:tcW w:w="995" w:type="dxa"/>
-            <w:noWrap/>
             <w:vAlign w:val="center"/>
           </w:tcPr>
           <w:p>
@@ -1944,7 +1954,6 @@
         <w:tc>
           <w:tcPr>
             <w:tcW w:w="995" w:type="dxa"/>
-            <w:noWrap/>
             <w:vAlign w:val="center"/>
           </w:tcPr>
           <w:p>
@@ -1971,7 +1980,6 @@
         <w:tc>
           <w:tcPr>
             <w:tcW w:w="995" w:type="dxa"/>
-            <w:noWrap/>
             <w:vAlign w:val="center"/>
           </w:tcPr>
           <w:p>
@@ -1998,7 +2006,6 @@
         <w:tc>
           <w:tcPr>
             <w:tcW w:w="995" w:type="dxa"/>
-            <w:noWrap/>
             <w:vAlign w:val="center"/>
           </w:tcPr>
           <w:p>
@@ -2025,7 +2032,6 @@
         <w:tc>
           <w:tcPr>
             <w:tcW w:w="995" w:type="dxa"/>
-            <w:noWrap/>
             <w:vAlign w:val="center"/>
           </w:tcPr>
           <w:p>
@@ -2124,7 +2130,6 @@
         <w:tc>
           <w:tcPr>
             <w:tcW w:w="995" w:type="dxa"/>
-            <w:noWrap/>
             <w:vAlign w:val="center"/>
           </w:tcPr>
           <w:p>
@@ -2151,7 +2156,6 @@
         <w:tc>
           <w:tcPr>
             <w:tcW w:w="995" w:type="dxa"/>
-            <w:noWrap/>
             <w:vAlign w:val="center"/>
           </w:tcPr>
           <w:p>
@@ -2178,7 +2182,6 @@
         <w:tc>
           <w:tcPr>
             <w:tcW w:w="995" w:type="dxa"/>
-            <w:noWrap/>
             <w:vAlign w:val="center"/>
           </w:tcPr>
           <w:p>
@@ -2205,7 +2208,6 @@
         <w:tc>
           <w:tcPr>
             <w:tcW w:w="995" w:type="dxa"/>
-            <w:noWrap/>
             <w:vAlign w:val="center"/>
           </w:tcPr>
           <w:p>
@@ -2232,7 +2234,6 @@
         <w:tc>
           <w:tcPr>
             <w:tcW w:w="995" w:type="dxa"/>
-            <w:noWrap/>
             <w:vAlign w:val="center"/>
           </w:tcPr>
           <w:p>
@@ -2351,7 +2352,6 @@
         <w:tc>
           <w:tcPr>
             <w:tcW w:w="995" w:type="dxa"/>
-            <w:noWrap/>
             <w:vAlign w:val="center"/>
           </w:tcPr>
           <w:p>
@@ -2378,7 +2378,6 @@
         <w:tc>
           <w:tcPr>
             <w:tcW w:w="995" w:type="dxa"/>
-            <w:noWrap/>
             <w:vAlign w:val="center"/>
           </w:tcPr>
           <w:p>
@@ -2405,7 +2404,6 @@
         <w:tc>
           <w:tcPr>
             <w:tcW w:w="995" w:type="dxa"/>
-            <w:noWrap/>
             <w:vAlign w:val="center"/>
           </w:tcPr>
           <w:p>
@@ -2432,7 +2430,6 @@
         <w:tc>
           <w:tcPr>
             <w:tcW w:w="995" w:type="dxa"/>
-            <w:noWrap/>
             <w:vAlign w:val="center"/>
           </w:tcPr>
           <w:p>
@@ -2459,7 +2456,6 @@
         <w:tc>
           <w:tcPr>
             <w:tcW w:w="995" w:type="dxa"/>
-            <w:noWrap/>
             <w:vAlign w:val="center"/>
           </w:tcPr>
           <w:p>
@@ -2578,7 +2574,6 @@
         <w:tc>
           <w:tcPr>
             <w:tcW w:w="995" w:type="dxa"/>
-            <w:noWrap/>
             <w:vAlign w:val="center"/>
           </w:tcPr>
           <w:p>
@@ -2605,7 +2600,6 @@
         <w:tc>
           <w:tcPr>
             <w:tcW w:w="995" w:type="dxa"/>
-            <w:noWrap/>
             <w:vAlign w:val="center"/>
           </w:tcPr>
           <w:p>
@@ -2632,7 +2626,6 @@
         <w:tc>
           <w:tcPr>
             <w:tcW w:w="995" w:type="dxa"/>
-            <w:noWrap/>
             <w:vAlign w:val="center"/>
           </w:tcPr>
           <w:p>
@@ -2659,7 +2652,6 @@
         <w:tc>
           <w:tcPr>
             <w:tcW w:w="995" w:type="dxa"/>
-            <w:noWrap/>
             <w:vAlign w:val="center"/>
           </w:tcPr>
           <w:p>
@@ -2686,7 +2678,6 @@
         <w:tc>
           <w:tcPr>
             <w:tcW w:w="995" w:type="dxa"/>
-            <w:noWrap/>
             <w:vAlign w:val="center"/>
           </w:tcPr>
           <w:p>
@@ -2785,7 +2776,6 @@
         <w:tc>
           <w:tcPr>
             <w:tcW w:w="995" w:type="dxa"/>
-            <w:noWrap/>
             <w:vAlign w:val="center"/>
           </w:tcPr>
           <w:p>
@@ -2812,7 +2802,6 @@
         <w:tc>
           <w:tcPr>
             <w:tcW w:w="995" w:type="dxa"/>
-            <w:noWrap/>
             <w:vAlign w:val="center"/>
           </w:tcPr>
           <w:p>
@@ -2839,7 +2828,6 @@
         <w:tc>
           <w:tcPr>
             <w:tcW w:w="995" w:type="dxa"/>
-            <w:noWrap/>
             <w:vAlign w:val="center"/>
           </w:tcPr>
           <w:p>
@@ -2866,7 +2854,6 @@
         <w:tc>
           <w:tcPr>
             <w:tcW w:w="995" w:type="dxa"/>
-            <w:noWrap/>
             <w:vAlign w:val="center"/>
           </w:tcPr>
           <w:p>
@@ -2893,7 +2880,6 @@
         <w:tc>
           <w:tcPr>
             <w:tcW w:w="995" w:type="dxa"/>
-            <w:noWrap/>
             <w:vAlign w:val="center"/>
           </w:tcPr>
           <w:p>
@@ -3001,7 +2987,6 @@
         <w:tc>
           <w:tcPr>
             <w:tcW w:w="995" w:type="dxa"/>
-            <w:noWrap/>
             <w:vAlign w:val="center"/>
           </w:tcPr>
           <w:p>
@@ -3028,7 +3013,6 @@
         <w:tc>
           <w:tcPr>
             <w:tcW w:w="995" w:type="dxa"/>
-            <w:noWrap/>
             <w:vAlign w:val="center"/>
           </w:tcPr>
           <w:p>
@@ -3055,7 +3039,6 @@
         <w:tc>
           <w:tcPr>
             <w:tcW w:w="995" w:type="dxa"/>
-            <w:noWrap/>
             <w:vAlign w:val="center"/>
           </w:tcPr>
           <w:p>
@@ -3082,7 +3065,6 @@
         <w:tc>
           <w:tcPr>
             <w:tcW w:w="995" w:type="dxa"/>
-            <w:noWrap/>
             <w:vAlign w:val="center"/>
           </w:tcPr>
           <w:p>
@@ -3109,7 +3091,6 @@
         <w:tc>
           <w:tcPr>
             <w:tcW w:w="995" w:type="dxa"/>
-            <w:noWrap/>
             <w:vAlign w:val="center"/>
           </w:tcPr>
           <w:p>
@@ -3167,7 +3148,6 @@
                 <w:b/>
                 <w:sz w:val="24"/>
                 <w:szCs w:val="24"/>
-                <w:lang w:eastAsia="es-MX"/>
               </w:rPr>
               <w:t xml:space="preserve">PUNTUACIÓN FINAL</w:t>
             </w:r>
@@ -3176,7 +3156,6 @@
         <w:tc>
           <w:tcPr>
             <w:tcW w:w="995" w:type="dxa"/>
-            <w:noWrap/>
             <w:vAlign w:val="center"/>
           </w:tcPr>
           <w:p>
@@ -3199,7 +3178,6 @@
         <w:tc>
           <w:tcPr>
             <w:tcW w:w="995" w:type="dxa"/>
-            <w:noWrap/>
             <w:vAlign w:val="center"/>
           </w:tcPr>
           <w:p>
@@ -3212,7 +3190,6 @@
         <w:tc>
           <w:tcPr>
             <w:tcW w:w="995" w:type="dxa"/>
-            <w:noWrap/>
             <w:vAlign w:val="center"/>
           </w:tcPr>
           <w:p>
@@ -3225,7 +3202,6 @@
         <w:tc>
           <w:tcPr>
             <w:tcW w:w="995" w:type="dxa"/>
-            <w:noWrap/>
             <w:vAlign w:val="center"/>
           </w:tcPr>
           <w:p>
@@ -3238,7 +3214,6 @@
         <w:tc>
           <w:tcPr>
             <w:tcW w:w="995" w:type="dxa"/>
-            <w:noWrap/>
             <w:vAlign w:val="center"/>
           </w:tcPr>
           <w:p>

</xml_diff>